<commit_message>
Build updated KVS documents
</commit_message>
<xml_diff>
--- a/KVS_Hebrew.docx
+++ b/KVS_Hebrew.docx
@@ -5,11 +5,12 @@
     <w:p>
       <w:pPr>
         <w:pStyle w:val="Heading1"/>
-        <w:jc w:val="right"/>
+        <w:jc w:val="center"/>
         <w:bidi w:val="1"/>
       </w:pPr>
       <w:r>
         <w:rPr>
+          <w:rFonts w:ascii="Arial" w:hAnsi="Arial" w:cs="Arial" w:eastAsia="Arial"/>
           <w:lang w:val="he-IL" w:bidi="he-IL"/>
           <w:rtl w:val="1"/>
         </w:rPr>
@@ -17,13 +18,19 @@
       </w:r>
     </w:p>
     <w:p>
+      <w:r>
+        <w:br w:type="page"/>
+      </w:r>
+    </w:p>
+    <w:p>
       <w:pPr>
         <w:pStyle w:val="Heading1"/>
-        <w:jc w:val="right"/>
+        <w:jc w:val="center"/>
         <w:bidi w:val="1"/>
       </w:pPr>
       <w:r>
         <w:rPr>
+          <w:rFonts w:ascii="Arial" w:hAnsi="Arial" w:cs="Arial" w:eastAsia="Arial"/>
           <w:lang w:val="he-IL" w:bidi="he-IL"/>
           <w:rtl w:val="1"/>
         </w:rPr>
@@ -33,29 +40,16 @@
     <w:p>
       <w:pPr>
         <w:pStyle w:val="Heading2"/>
-        <w:jc w:val="right"/>
+        <w:jc w:val="center"/>
         <w:bidi w:val="1"/>
       </w:pPr>
       <w:r>
         <w:rPr>
+          <w:rFonts w:ascii="Arial" w:hAnsi="Arial" w:cs="Arial" w:eastAsia="Arial"/>
           <w:lang w:val="he-IL" w:bidi="he-IL"/>
           <w:rtl w:val="1"/>
         </w:rPr>
         <w:t>רקע היסטורי</w:t>
-      </w:r>
-    </w:p>
-    <w:p>
-      <w:pPr>
-        <w:pStyle w:val="Heading2"/>
-        <w:jc w:val="right"/>
-        <w:bidi w:val="1"/>
-      </w:pPr>
-      <w:r>
-        <w:rPr>
-          <w:lang w:val="he-IL" w:bidi="he-IL"/>
-          <w:rtl w:val="1"/>
-        </w:rPr>
-        <w:t>מחזה</w:t>
       </w:r>
     </w:p>
     <w:sectPr>
@@ -432,10 +426,11 @@
     <w:qFormat/>
     <w:rsid w:val="00FC693F"/>
     <w:pPr>
+      <w:widowControl/>
       <w:spacing w:line="276" w:lineRule="auto" w:after="80"/>
     </w:pPr>
     <w:rPr>
-      <w:rFonts w:ascii="Arial" w:hAnsi="Arial" w:eastAsia="Arial"/>
+      <w:rFonts w:ascii="Arial" w:hAnsi="Arial" w:cs="Arial" w:eastAsia="Arial"/>
       <w:sz w:val="22"/>
     </w:rPr>
   </w:style>
@@ -494,11 +489,11 @@
     <w:pPr>
       <w:keepNext/>
       <w:keepLines/>
-      <w:spacing w:before="160" w:after="100"/>
+      <w:spacing w:before="0" w:after="120"/>
       <w:outlineLvl w:val="0"/>
     </w:pPr>
     <w:rPr>
-      <w:rFonts w:asciiTheme="majorHAnsi" w:eastAsiaTheme="majorEastAsia" w:hAnsiTheme="majorHAnsi" w:cstheme="majorBidi" w:ascii="Arial" w:hAnsi="Arial" w:eastAsia="Arial"/>
+      <w:rFonts w:asciiTheme="majorHAnsi" w:eastAsiaTheme="majorEastAsia" w:hAnsiTheme="majorHAnsi" w:cstheme="majorBidi" w:ascii="Arial" w:hAnsi="Arial" w:cs="Arial" w:eastAsia="Arial"/>
       <w:b/>
       <w:bCs/>
       <w:color w:val="000000"/>
@@ -518,11 +513,11 @@
     <w:pPr>
       <w:keepNext/>
       <w:keepLines/>
-      <w:spacing w:before="160" w:after="100"/>
+      <w:spacing w:before="0" w:after="120"/>
       <w:outlineLvl w:val="1"/>
     </w:pPr>
     <w:rPr>
-      <w:rFonts w:asciiTheme="majorHAnsi" w:eastAsiaTheme="majorEastAsia" w:hAnsiTheme="majorHAnsi" w:cstheme="majorBidi" w:ascii="Arial" w:hAnsi="Arial" w:eastAsia="Arial"/>
+      <w:rFonts w:asciiTheme="majorHAnsi" w:eastAsiaTheme="majorEastAsia" w:hAnsiTheme="majorHAnsi" w:cstheme="majorBidi" w:ascii="Arial" w:hAnsi="Arial" w:cs="Arial" w:eastAsia="Arial"/>
       <w:b/>
       <w:bCs/>
       <w:color w:val="000000"/>

</xml_diff>